<commit_message>
Retroactive Sefaria verification pass on last 4 weekly shiurim: correct fn refs (Sanhedrin 37b/תשובת הגאונים, Rama OC 281:1/Or Zarua, Divrei HaYamim I 22:8 quote fix, RH 32a/34b swap)
</commit_message>
<xml_diff>
--- a/2026-08-09 — Entering Shabbos Shacharis — מִזְמוֹר לְתוֹדָה, תפילין, and the Seventh Wing — styled.docx
+++ b/2026-08-09 — Entering Shabbos Shacharis — מִזְמוֹר לְתוֹדָה, תפילין, and the Seventh Wing — styled.docx
@@ -5180,7 +5180,7 @@
           <w:color w:val="1A1A1A"/>
           <w:sz w:val="22"/>
         </w:rPr>
-        <w:t xml:space="preserve"> on Shabbos? The Rav returns to a זוהר brought in </w:t>
+        <w:t xml:space="preserve"> on Shabbos? The Rav returns to a tradition brought in </w:t>
       </w:r>
       <w:r>
         <w:rPr>
@@ -5190,7 +5190,27 @@
           <w:color w:val="1A1A1A"/>
           <w:sz w:val="22"/>
         </w:rPr>
-        <w:t>תוספות, סנהדרין דף ל״ז</w:t>
+        <w:t>תוספות, סנהדרין דף ל״ז ע״ב</w:t>
+      </w:r>
+      <w:r>
+        <w:rPr>
+          <w:rFonts w:ascii="Georgia" w:hAnsi="Georgia" w:cs="SBL Hebrew" w:eastAsia="Georgia"/>
+          <w:b w:val="0"/>
+          <w:i w:val="0"/>
+          <w:color w:val="1A1A1A"/>
+          <w:sz w:val="22"/>
+        </w:rPr>
+        <w:t xml:space="preserve"> (ד״ה "מכנף הארץ") in the name of </w:t>
+      </w:r>
+      <w:r>
+        <w:rPr>
+          <w:rFonts w:ascii="Georgia" w:hAnsi="Georgia" w:cs="SBL Hebrew" w:eastAsia="Georgia"/>
+          <w:b/>
+          <w:i w:val="0"/>
+          <w:color w:val="1A1A1A"/>
+          <w:sz w:val="22"/>
+        </w:rPr>
+        <w:t>תשובת הגאונים</w:t>
       </w:r>
       <w:r>
         <w:rPr>
@@ -8926,7 +8946,47 @@
                 <w:color w:val="3B3B3B"/>
                 <w:sz w:val="20"/>
               </w:rPr>
-              <w:t>The Rav cited this as coming from "the Mordechai in the name of Rav Hai Gaon via a Rishon in Rome." The tradition is well-attested in the Mordechai and cited by the Ramo. Standard reference: Mordechai on Shabbos פרק אחד עשר (הזורק).</w:t>
+              <w:t xml:space="preserve">Sefaria verification: the Rama in </w:t>
+            </w:r>
+            <w:r>
+              <w:rPr>
+                <w:rFonts w:ascii="Georgia" w:hAnsi="Georgia" w:cs="SBL Hebrew" w:eastAsia="Georgia"/>
+                <w:b/>
+                <w:i w:val="0"/>
+                <w:color w:val="3B3B3B"/>
+                <w:sz w:val="20"/>
+              </w:rPr>
+              <w:t>שולחן ערוך אורח חיים רפ״א:א</w:t>
+            </w:r>
+            <w:r>
+              <w:rPr>
+                <w:rFonts w:ascii="Georgia" w:hAnsi="Georgia" w:cs="SBL Hebrew" w:eastAsia="Georgia"/>
+                <w:b w:val="0"/>
+                <w:i w:val="0"/>
+                <w:color w:val="3B3B3B"/>
+                <w:sz w:val="20"/>
+              </w:rPr>
+              <w:t xml:space="preserve"> explicitly cites the Mordechai as the source: </w:t>
+            </w:r>
+            <w:r>
+              <w:rPr>
+                <w:rFonts w:ascii="SBL Hebrew" w:hAnsi="SBL Hebrew" w:cs="SBL Hebrew" w:eastAsia="SBL Hebrew"/>
+                <w:b w:val="0"/>
+                <w:i w:val="0"/>
+                <w:color w:val="3B3B3B"/>
+                <w:sz w:val="20"/>
+              </w:rPr>
+              <w:t>"נהגו לבוא לבית הכנסת בשבת יותר מאוחר... שהתמיד של חול נאמר בו בבקר ובשבת נאמר וביום השבת מאוחר (מרדכי)."</w:t>
+            </w:r>
+            <w:r>
+              <w:rPr>
+                <w:rFonts w:ascii="Georgia" w:hAnsi="Georgia" w:cs="SBL Hebrew" w:eastAsia="Georgia"/>
+                <w:b w:val="0"/>
+                <w:i w:val="0"/>
+                <w:color w:val="3B3B3B"/>
+                <w:sz w:val="20"/>
+              </w:rPr>
+              <w:t xml:space="preserve"> The pasuk-based reasoning is thus preserved verbatim in the Rama itself.</w:t>
             </w:r>
           </w:p>
         </w:tc>
@@ -10168,7 +10228,7 @@
           <w:color w:val="1A1A1A"/>
           <w:sz w:val="21"/>
         </w:rPr>
-        <w:t xml:space="preserve">מ״ב — protesting the שליח ציבור for taking long is prohibited even </w:t>
+        <w:t xml:space="preserve">רמ״א אורח חיים רפ״א:א בשם האור זרוע — protesting the שליח ציבור for taking long is prohibited even </w:t>
       </w:r>
       <w:r>
         <w:rPr>
@@ -10196,6 +10256,149 @@
           <w:color w:val="1A1A1A"/>
           <w:sz w:val="21"/>
         </w:rPr>
+        <w:t xml:space="preserve">The primary source for this ruling is the </w:t>
+      </w:r>
+      <w:r>
+        <w:rPr>
+          <w:rFonts w:ascii="Georgia" w:hAnsi="Georgia" w:cs="SBL Hebrew" w:eastAsia="Georgia"/>
+          <w:b/>
+          <w:i w:val="0"/>
+          <w:color w:val="1A1A1A"/>
+          <w:sz w:val="21"/>
+        </w:rPr>
+        <w:t>רמ״א אורח חיים רפ״א:א</w:t>
+      </w:r>
+      <w:r>
+        <w:rPr>
+          <w:rFonts w:ascii="Georgia" w:hAnsi="Georgia" w:cs="SBL Hebrew" w:eastAsia="Georgia"/>
+          <w:b w:val="0"/>
+          <w:i w:val="0"/>
+          <w:color w:val="1A1A1A"/>
+          <w:sz w:val="21"/>
+        </w:rPr>
+        <w:t xml:space="preserve">, citing the </w:t>
+      </w:r>
+      <w:r>
+        <w:rPr>
+          <w:rFonts w:ascii="Georgia" w:hAnsi="Georgia" w:cs="SBL Hebrew" w:eastAsia="Georgia"/>
+          <w:b/>
+          <w:i w:val="0"/>
+          <w:color w:val="1A1A1A"/>
+          <w:sz w:val="21"/>
+        </w:rPr>
+        <w:t>אור זרוע</w:t>
+      </w:r>
+      <w:r>
+        <w:rPr>
+          <w:rFonts w:ascii="Georgia" w:hAnsi="Georgia" w:cs="SBL Hebrew" w:eastAsia="Georgia"/>
+          <w:b w:val="0"/>
+          <w:i w:val="0"/>
+          <w:color w:val="1A1A1A"/>
+          <w:sz w:val="21"/>
+        </w:rPr>
+        <w:t xml:space="preserve">: </w:t>
+      </w:r>
+      <w:r>
+        <w:rPr>
+          <w:rFonts w:ascii="SBL Hebrew" w:hAnsi="SBL Hebrew" w:cs="SBL Hebrew" w:eastAsia="SBL Hebrew"/>
+          <w:b w:val="0"/>
+          <w:i w:val="0"/>
+          <w:color w:val="1A1A1A"/>
+          <w:sz w:val="21"/>
+        </w:rPr>
+        <w:t>"וראוי להאריך בפיוטים ובזמירות בשבת ובניגון נעים להאריך שהוא כבוד היום, ואין מוחין בשליח צבור המאריך אף על פי שכוונת המוחה לשם שמים משום ביטול תורה."</w:t>
+      </w:r>
+      <w:r>
+        <w:rPr>
+          <w:rFonts w:ascii="Georgia" w:hAnsi="Georgia" w:cs="SBL Hebrew" w:eastAsia="Georgia"/>
+          <w:b w:val="0"/>
+          <w:i w:val="0"/>
+          <w:color w:val="1A1A1A"/>
+          <w:sz w:val="21"/>
+        </w:rPr>
+        <w:t xml:space="preserve"> The משנה ברורה codifies this in his commentary on the same siman. The </w:t>
+      </w:r>
+      <w:r>
+        <w:rPr>
+          <w:rFonts w:ascii="SBL Hebrew" w:hAnsi="SBL Hebrew" w:cs="SBL Hebrew" w:eastAsia="SBL Hebrew"/>
+          <w:b w:val="0"/>
+          <w:i w:val="0"/>
+          <w:color w:val="1A1A1A"/>
+          <w:sz w:val="21"/>
+        </w:rPr>
+        <w:t>עיקר הדין</w:t>
+      </w:r>
+      <w:r>
+        <w:rPr>
+          <w:rFonts w:ascii="Georgia" w:hAnsi="Georgia" w:cs="SBL Hebrew" w:eastAsia="Georgia"/>
+          <w:b w:val="0"/>
+          <w:i w:val="0"/>
+          <w:color w:val="1A1A1A"/>
+          <w:sz w:val="21"/>
+        </w:rPr>
+        <w:t xml:space="preserve"> is that פסוקי דזמרה should be said </w:t>
+      </w:r>
+      <w:r>
+        <w:rPr>
+          <w:rFonts w:ascii="SBL Hebrew" w:hAnsi="SBL Hebrew" w:cs="SBL Hebrew" w:eastAsia="SBL Hebrew"/>
+          <w:b w:val="0"/>
+          <w:i w:val="0"/>
+          <w:color w:val="1A1A1A"/>
+          <w:sz w:val="21"/>
+        </w:rPr>
+        <w:t>בְנַחַת וּבְכוונה</w:t>
+      </w:r>
+      <w:r>
+        <w:rPr>
+          <w:rFonts w:ascii="Georgia" w:hAnsi="Georgia" w:cs="SBL Hebrew" w:eastAsia="Georgia"/>
+          <w:b w:val="0"/>
+          <w:i w:val="0"/>
+          <w:color w:val="1A1A1A"/>
+          <w:sz w:val="21"/>
+        </w:rPr>
+        <w:t>. Shabbos gives extra time and the שליח ציבור is halachically entitled to use it.</w:t>
+      </w:r>
+    </w:p>
+    <w:p>
+      <w:pPr>
+        <w:spacing w:before="0" w:after="80" w:line="312" w:lineRule="auto"/>
+        <w:ind w:left="480" w:hanging="480"/>
+      </w:pPr>
+      <w:r>
+        <w:rPr>
+          <w:rFonts w:ascii="Georgia" w:hAnsi="Georgia" w:cs="SBL Hebrew" w:eastAsia="Georgia"/>
+          <w:b/>
+          <w:color w:val="B8860B"/>
+          <w:sz w:val="21"/>
+        </w:rPr>
+        <w:t xml:space="preserve">18. </w:t>
+      </w:r>
+      <w:r>
+        <w:rPr>
+          <w:rFonts w:ascii="Georgia" w:hAnsi="Georgia" w:cs="SBL Hebrew" w:eastAsia="Georgia"/>
+          <w:b w:val="0"/>
+          <w:i w:val="0"/>
+          <w:color w:val="1A1A1A"/>
+          <w:sz w:val="21"/>
+        </w:rPr>
+        <w:t>מ״ב — late-arrival priorities on Shabbos morning</w:t>
+      </w:r>
+      <w:r>
+        <w:rPr>
+          <w:rFonts w:ascii="Georgia" w:hAnsi="Georgia" w:cs="SBL Hebrew" w:eastAsia="Georgia"/>
+          <w:color w:val="1A1A1A"/>
+          <w:sz w:val="21"/>
+        </w:rPr>
+        <w:t xml:space="preserve"> — </w:t>
+      </w:r>
+      <w:r>
+        <w:rPr>
+          <w:rFonts w:ascii="Georgia" w:hAnsi="Georgia" w:cs="SBL Hebrew" w:eastAsia="Georgia"/>
+          <w:b w:val="0"/>
+          <w:i w:val="0"/>
+          <w:color w:val="1A1A1A"/>
+          <w:sz w:val="21"/>
+        </w:rPr>
         <w:t xml:space="preserve">The </w:t>
       </w:r>
       <w:r>
@@ -10216,7 +10419,7 @@
           <w:color w:val="1A1A1A"/>
           <w:sz w:val="21"/>
         </w:rPr>
-        <w:t xml:space="preserve"> writes explicitly that if the שליח ציבור is being </w:t>
+        <w:t xml:space="preserve"> gives an explicit hierarchy for one who arrives late to Shabbos morning davening and needs to catch up: (1) </w:t>
       </w:r>
       <w:r>
         <w:rPr>
@@ -10226,17 +10429,77 @@
           <w:color w:val="1A1A1A"/>
           <w:sz w:val="21"/>
         </w:rPr>
-        <w:t>מַאֲרִיךְ</w:t>
-      </w:r>
-      <w:r>
-        <w:rPr>
-          <w:rFonts w:ascii="Georgia" w:hAnsi="Georgia" w:cs="SBL Hebrew" w:eastAsia="Georgia"/>
-          <w:b w:val="0"/>
-          <w:i w:val="0"/>
-          <w:color w:val="1A1A1A"/>
-          <w:sz w:val="21"/>
-        </w:rPr>
-        <w:t xml:space="preserve"> in פסוקי דזמרה — taking his time, singing, davening with כוונה — a member of the tzibbur is </w:t>
+        <w:t>בָּרוּךְ שֶׁאָמַר</w:t>
+      </w:r>
+      <w:r>
+        <w:rPr>
+          <w:rFonts w:ascii="Georgia" w:hAnsi="Georgia" w:cs="SBL Hebrew" w:eastAsia="Georgia"/>
+          <w:b w:val="0"/>
+          <w:i w:val="0"/>
+          <w:color w:val="1A1A1A"/>
+          <w:sz w:val="21"/>
+        </w:rPr>
+        <w:t xml:space="preserve"> — the opening ברכה of פסוקי דזמרה; (2) </w:t>
+      </w:r>
+      <w:r>
+        <w:rPr>
+          <w:rFonts w:ascii="SBL Hebrew" w:hAnsi="SBL Hebrew" w:cs="SBL Hebrew" w:eastAsia="SBL Hebrew"/>
+          <w:b w:val="0"/>
+          <w:i w:val="0"/>
+          <w:color w:val="1A1A1A"/>
+          <w:sz w:val="21"/>
+        </w:rPr>
+        <w:t>אַשְׁרֵי</w:t>
+      </w:r>
+      <w:r>
+        <w:rPr>
+          <w:rFonts w:ascii="Georgia" w:hAnsi="Georgia" w:cs="SBL Hebrew" w:eastAsia="Georgia"/>
+          <w:b w:val="0"/>
+          <w:i w:val="0"/>
+          <w:color w:val="1A1A1A"/>
+          <w:sz w:val="21"/>
+        </w:rPr>
+        <w:t xml:space="preserve"> (תהילים קמ״ה) — the halachically central פרק of the section; (3) </w:t>
+      </w:r>
+      <w:r>
+        <w:rPr>
+          <w:rFonts w:ascii="SBL Hebrew" w:hAnsi="SBL Hebrew" w:cs="SBL Hebrew" w:eastAsia="SBL Hebrew"/>
+          <w:b w:val="0"/>
+          <w:i w:val="0"/>
+          <w:color w:val="1A1A1A"/>
+          <w:sz w:val="21"/>
+        </w:rPr>
+        <w:t>יִשְׁתַּבַּח</w:t>
+      </w:r>
+      <w:r>
+        <w:rPr>
+          <w:rFonts w:ascii="Georgia" w:hAnsi="Georgia" w:cs="SBL Hebrew" w:eastAsia="Georgia"/>
+          <w:b w:val="0"/>
+          <w:i w:val="0"/>
+          <w:color w:val="1A1A1A"/>
+          <w:sz w:val="21"/>
+        </w:rPr>
+        <w:t xml:space="preserve"> — the closing ברכה; (4) </w:t>
+      </w:r>
+      <w:r>
+        <w:rPr>
+          <w:rFonts w:ascii="SBL Hebrew" w:hAnsi="SBL Hebrew" w:cs="SBL Hebrew" w:eastAsia="SBL Hebrew"/>
+          <w:b w:val="0"/>
+          <w:i w:val="0"/>
+          <w:color w:val="1A1A1A"/>
+          <w:sz w:val="21"/>
+        </w:rPr>
+        <w:t>נִשְׁמַת כָּל חַי</w:t>
+      </w:r>
+      <w:r>
+        <w:rPr>
+          <w:rFonts w:ascii="Georgia" w:hAnsi="Georgia" w:cs="SBL Hebrew" w:eastAsia="Georgia"/>
+          <w:b w:val="0"/>
+          <w:i w:val="0"/>
+          <w:color w:val="1A1A1A"/>
+          <w:sz w:val="21"/>
+        </w:rPr>
+        <w:t xml:space="preserve"> — the Shabbos-specific centerpiece of the extended שירה. The משנה ברורה is explicit that the extra קפּיטלַך added on Shabbos are </w:t>
       </w:r>
       <w:r>
         <w:rPr>
@@ -10256,27 +10519,7 @@
           <w:color w:val="1A1A1A"/>
           <w:sz w:val="21"/>
         </w:rPr>
-        <w:t xml:space="preserve"> permitted to protest and pressure him to speed up, </w:t>
-      </w:r>
-      <w:r>
-        <w:rPr>
-          <w:rFonts w:ascii="Georgia" w:hAnsi="Georgia" w:cs="SBL Hebrew" w:eastAsia="Georgia"/>
-          <w:b w:val="0"/>
-          <w:i/>
-          <w:color w:val="1A1A1A"/>
-          <w:sz w:val="21"/>
-        </w:rPr>
-        <w:t>even if</w:t>
-      </w:r>
-      <w:r>
-        <w:rPr>
-          <w:rFonts w:ascii="Georgia" w:hAnsi="Georgia" w:cs="SBL Hebrew" w:eastAsia="Georgia"/>
-          <w:b w:val="0"/>
-          <w:i w:val="0"/>
-          <w:color w:val="1A1A1A"/>
-          <w:sz w:val="21"/>
-        </w:rPr>
-        <w:t xml:space="preserve"> the protester's motivation is </w:t>
+        <w:t xml:space="preserve"> </w:t>
       </w:r>
       <w:r>
         <w:rPr>
@@ -10286,17 +10529,70 @@
           <w:color w:val="1A1A1A"/>
           <w:sz w:val="21"/>
         </w:rPr>
-        <w:t>לשם שמים</w:t>
-      </w:r>
-      <w:r>
-        <w:rPr>
-          <w:rFonts w:ascii="Georgia" w:hAnsi="Georgia" w:cs="SBL Hebrew" w:eastAsia="Georgia"/>
-          <w:b w:val="0"/>
-          <w:i w:val="0"/>
-          <w:color w:val="1A1A1A"/>
-          <w:sz w:val="21"/>
-        </w:rPr>
-        <w:t xml:space="preserve"> — even if the concern is </w:t>
+        <w:t>מעכב</w:t>
+      </w:r>
+      <w:r>
+        <w:rPr>
+          <w:rFonts w:ascii="Georgia" w:hAnsi="Georgia" w:cs="SBL Hebrew" w:eastAsia="Georgia"/>
+          <w:b w:val="0"/>
+          <w:i w:val="0"/>
+          <w:color w:val="1A1A1A"/>
+          <w:sz w:val="21"/>
+        </w:rPr>
+        <w:t xml:space="preserve"> — they may be omitted if time is tight and made up later if desired. But נִשְׁמַת is not to be missed. It is the central Shabbos-specific piece of the entire שירה of the morning.</w:t>
+      </w:r>
+    </w:p>
+    <w:p>
+      <w:pPr>
+        <w:spacing w:before="0" w:after="80" w:line="312" w:lineRule="auto"/>
+        <w:ind w:left="480" w:hanging="480"/>
+      </w:pPr>
+      <w:r>
+        <w:rPr>
+          <w:rFonts w:ascii="Georgia" w:hAnsi="Georgia" w:cs="SBL Hebrew" w:eastAsia="Georgia"/>
+          <w:b/>
+          <w:color w:val="B8860B"/>
+          <w:sz w:val="21"/>
+        </w:rPr>
+        <w:t xml:space="preserve">19. </w:t>
+      </w:r>
+      <w:r>
+        <w:rPr>
+          <w:rFonts w:ascii="Georgia" w:hAnsi="Georgia" w:cs="SBL Hebrew" w:eastAsia="Georgia"/>
+          <w:b w:val="0"/>
+          <w:i w:val="0"/>
+          <w:color w:val="1A1A1A"/>
+          <w:sz w:val="21"/>
+        </w:rPr>
+        <w:t>תוספות סנהדרין ל״ז ב', ד״ה "מכנף הארץ זמירות שמענו," בשם תשובת הגאונים — the seventh wing</w:t>
+      </w:r>
+      <w:r>
+        <w:rPr>
+          <w:rFonts w:ascii="Georgia" w:hAnsi="Georgia" w:cs="SBL Hebrew" w:eastAsia="Georgia"/>
+          <w:color w:val="1A1A1A"/>
+          <w:sz w:val="21"/>
+        </w:rPr>
+        <w:t xml:space="preserve"> — </w:t>
+      </w:r>
+      <w:r>
+        <w:rPr>
+          <w:rFonts w:ascii="Georgia" w:hAnsi="Georgia" w:cs="SBL Hebrew" w:eastAsia="Georgia"/>
+          <w:b/>
+          <w:i w:val="0"/>
+          <w:color w:val="1A1A1A"/>
+          <w:sz w:val="21"/>
+        </w:rPr>
+        <w:t>תוספות במסכת סנהדרין דף ל״ז ע״ב</w:t>
+      </w:r>
+      <w:r>
+        <w:rPr>
+          <w:rFonts w:ascii="Georgia" w:hAnsi="Georgia" w:cs="SBL Hebrew" w:eastAsia="Georgia"/>
+          <w:b w:val="0"/>
+          <w:i w:val="0"/>
+          <w:color w:val="1A1A1A"/>
+          <w:sz w:val="21"/>
+        </w:rPr>
+        <w:t xml:space="preserve">, on the words </w:t>
       </w:r>
       <w:r>
         <w:rPr>
@@ -10306,17 +10602,57 @@
           <w:color w:val="1A1A1A"/>
           <w:sz w:val="21"/>
         </w:rPr>
-        <w:t>ביטול תורה</w:t>
-      </w:r>
-      <w:r>
-        <w:rPr>
-          <w:rFonts w:ascii="Georgia" w:hAnsi="Georgia" w:cs="SBL Hebrew" w:eastAsia="Georgia"/>
-          <w:b w:val="0"/>
-          <w:i w:val="0"/>
-          <w:color w:val="1A1A1A"/>
-          <w:sz w:val="21"/>
-        </w:rPr>
-        <w:t xml:space="preserve"> from the extra minutes lost. The </w:t>
+        <w:t>"מכנף הארץ זמירות שמענו"</w:t>
+      </w:r>
+      <w:r>
+        <w:rPr>
+          <w:rFonts w:ascii="Georgia" w:hAnsi="Georgia" w:cs="SBL Hebrew" w:eastAsia="Georgia"/>
+          <w:b w:val="0"/>
+          <w:i w:val="0"/>
+          <w:color w:val="1A1A1A"/>
+          <w:sz w:val="21"/>
+        </w:rPr>
+        <w:t xml:space="preserve"> (ישעיהו כ״ד:ט״ז), cites </w:t>
+      </w:r>
+      <w:r>
+        <w:rPr>
+          <w:rFonts w:ascii="Georgia" w:hAnsi="Georgia" w:cs="SBL Hebrew" w:eastAsia="Georgia"/>
+          <w:b/>
+          <w:i w:val="0"/>
+          <w:color w:val="1A1A1A"/>
+          <w:sz w:val="21"/>
+        </w:rPr>
+        <w:t>תשובת הגאונים</w:t>
+      </w:r>
+      <w:r>
+        <w:rPr>
+          <w:rFonts w:ascii="Georgia" w:hAnsi="Georgia" w:cs="SBL Hebrew" w:eastAsia="Georgia"/>
+          <w:b w:val="0"/>
+          <w:i w:val="0"/>
+          <w:color w:val="1A1A1A"/>
+          <w:sz w:val="21"/>
+        </w:rPr>
+        <w:t xml:space="preserve"> for this chiddush. The pasuk in </w:t>
+      </w:r>
+      <w:r>
+        <w:rPr>
+          <w:rFonts w:ascii="Georgia" w:hAnsi="Georgia" w:cs="SBL Hebrew" w:eastAsia="Georgia"/>
+          <w:b/>
+          <w:i w:val="0"/>
+          <w:color w:val="1A1A1A"/>
+          <w:sz w:val="21"/>
+        </w:rPr>
+        <w:t>ישעיהו ו׳:ב</w:t>
+      </w:r>
+      <w:r>
+        <w:rPr>
+          <w:rFonts w:ascii="Georgia" w:hAnsi="Georgia" w:cs="SBL Hebrew" w:eastAsia="Georgia"/>
+          <w:b w:val="0"/>
+          <w:i w:val="0"/>
+          <w:color w:val="1A1A1A"/>
+          <w:sz w:val="21"/>
+        </w:rPr>
+        <w:t xml:space="preserve"> describes: </w:t>
       </w:r>
       <w:r>
         <w:rPr>
@@ -10326,17 +10662,17 @@
           <w:color w:val="1A1A1A"/>
           <w:sz w:val="21"/>
         </w:rPr>
-        <w:t>עיקר הדין</w:t>
-      </w:r>
-      <w:r>
-        <w:rPr>
-          <w:rFonts w:ascii="Georgia" w:hAnsi="Georgia" w:cs="SBL Hebrew" w:eastAsia="Georgia"/>
-          <w:b w:val="0"/>
-          <w:i w:val="0"/>
-          <w:color w:val="1A1A1A"/>
-          <w:sz w:val="21"/>
-        </w:rPr>
-        <w:t xml:space="preserve"> is that פסוקי דזמרה should be said </w:t>
+        <w:t>"שֵׁשׁ כְּנָפַיִם שֵׁשׁ כְּנָפַיִם לְאֶחָד"</w:t>
+      </w:r>
+      <w:r>
+        <w:rPr>
+          <w:rFonts w:ascii="Georgia" w:hAnsi="Georgia" w:cs="SBL Hebrew" w:eastAsia="Georgia"/>
+          <w:b w:val="0"/>
+          <w:i w:val="0"/>
+          <w:color w:val="1A1A1A"/>
+          <w:sz w:val="21"/>
+        </w:rPr>
+        <w:t xml:space="preserve"> — six wings per שרף. Each wing sings שירה on one day of the week — through the six weekdays. When Shabbos arrives the חיות say before הקב״ה: </w:t>
       </w:r>
       <w:r>
         <w:rPr>
@@ -10346,17 +10682,57 @@
           <w:color w:val="1A1A1A"/>
           <w:sz w:val="21"/>
         </w:rPr>
-        <w:t>בְנַחַת וּבְכוונה</w:t>
-      </w:r>
-      <w:r>
-        <w:rPr>
-          <w:rFonts w:ascii="Georgia" w:hAnsi="Georgia" w:cs="SBL Hebrew" w:eastAsia="Georgia"/>
-          <w:b w:val="0"/>
-          <w:i w:val="0"/>
-          <w:color w:val="1A1A1A"/>
-          <w:sz w:val="21"/>
-        </w:rPr>
-        <w:t>. Shabbos gives extra time and the שליח ציבור is halachically entitled to use it.</w:t>
+        <w:t>"רבש״ע אין לנו עוד כנף"</w:t>
+      </w:r>
+      <w:r>
+        <w:rPr>
+          <w:rFonts w:ascii="Georgia" w:hAnsi="Georgia" w:cs="SBL Hebrew" w:eastAsia="Georgia"/>
+          <w:b w:val="0"/>
+          <w:i w:val="0"/>
+          <w:color w:val="1A1A1A"/>
+          <w:sz w:val="21"/>
+        </w:rPr>
+        <w:t xml:space="preserve">. The answer: </w:t>
+      </w:r>
+      <w:r>
+        <w:rPr>
+          <w:rFonts w:ascii="SBL Hebrew" w:hAnsi="SBL Hebrew" w:cs="SBL Hebrew" w:eastAsia="SBL Hebrew"/>
+          <w:b w:val="0"/>
+          <w:i w:val="0"/>
+          <w:color w:val="1A1A1A"/>
+          <w:sz w:val="21"/>
+        </w:rPr>
+        <w:t>"יש לי עוד כנף אחד שאומר לפני שירה, שנאמר מכנף הארץ זמירות שמענו"</w:t>
+      </w:r>
+      <w:r>
+        <w:rPr>
+          <w:rFonts w:ascii="Georgia" w:hAnsi="Georgia" w:cs="SBL Hebrew" w:eastAsia="Georgia"/>
+          <w:b w:val="0"/>
+          <w:i w:val="0"/>
+          <w:color w:val="1A1A1A"/>
+          <w:sz w:val="21"/>
+        </w:rPr>
+        <w:t xml:space="preserve"> — </w:t>
+      </w:r>
+      <w:r>
+        <w:rPr>
+          <w:rFonts w:ascii="SBL Hebrew" w:hAnsi="SBL Hebrew" w:cs="SBL Hebrew" w:eastAsia="SBL Hebrew"/>
+          <w:b w:val="0"/>
+          <w:i w:val="0"/>
+          <w:color w:val="1A1A1A"/>
+          <w:sz w:val="21"/>
+        </w:rPr>
+        <w:t>כנסת ישראל</w:t>
+      </w:r>
+      <w:r>
+        <w:rPr>
+          <w:rFonts w:ascii="Georgia" w:hAnsi="Georgia" w:cs="SBL Hebrew" w:eastAsia="Georgia"/>
+          <w:b w:val="0"/>
+          <w:i w:val="0"/>
+          <w:color w:val="1A1A1A"/>
+          <w:sz w:val="21"/>
+        </w:rPr>
+        <w:t xml:space="preserve"> is the seventh wing. The Geonic teshuvah cites this to explain why in Eretz Yisrael in Geonic times קדושה was recited only on Shabbos. The added Shabbos-morning מזמורים are, structurally, the שירה of the מלאכים now sung by Klal Yisrael.</w:t>
       </w:r>
       <w:r>
         <w:rPr>
@@ -10405,7 +10781,47 @@
                 <w:color w:val="3B3B3B"/>
                 <w:sz w:val="20"/>
               </w:rPr>
-              <w:t>Specific siman/סעיף in משנה ברורה was not cited in the shiur — the ruling appears in the general discussion of פסוקי דזמרה in סימנים נ״א–נ״ג.</w:t>
+              <w:t xml:space="preserve">Sefaria verification: the Tosafos is on Sanhedrin 37b (not 37a), and the source is </w:t>
+            </w:r>
+            <w:r>
+              <w:rPr>
+                <w:rFonts w:ascii="Georgia" w:hAnsi="Georgia" w:cs="SBL Hebrew" w:eastAsia="Georgia"/>
+                <w:b w:val="0"/>
+                <w:i/>
+                <w:color w:val="3B3B3B"/>
+                <w:sz w:val="20"/>
+              </w:rPr>
+              <w:t>Teshuvas HaGeonim</w:t>
+            </w:r>
+            <w:r>
+              <w:rPr>
+                <w:rFonts w:ascii="Georgia" w:hAnsi="Georgia" w:cs="SBL Hebrew" w:eastAsia="Georgia"/>
+                <w:b w:val="0"/>
+                <w:i w:val="0"/>
+                <w:color w:val="3B3B3B"/>
+                <w:sz w:val="20"/>
+              </w:rPr>
+              <w:t xml:space="preserve"> quoted in Tosafos — not the Zohar. The Rav referred to "a Zohar in Tosafos"; the actual attribution in the printed Tosafos is to the Geonim. The pasuk-derivation for the seventh wing is </w:t>
+            </w:r>
+            <w:r>
+              <w:rPr>
+                <w:rFonts w:ascii="SBL Hebrew" w:hAnsi="SBL Hebrew" w:cs="SBL Hebrew" w:eastAsia="SBL Hebrew"/>
+                <w:b w:val="0"/>
+                <w:i w:val="0"/>
+                <w:color w:val="3B3B3B"/>
+                <w:sz w:val="20"/>
+              </w:rPr>
+              <w:t>"מכנף הארץ זמירות שמענו"</w:t>
+            </w:r>
+            <w:r>
+              <w:rPr>
+                <w:rFonts w:ascii="Georgia" w:hAnsi="Georgia" w:cs="SBL Hebrew" w:eastAsia="Georgia"/>
+                <w:b w:val="0"/>
+                <w:i w:val="0"/>
+                <w:color w:val="3B3B3B"/>
+                <w:sz w:val="20"/>
+              </w:rPr>
+              <w:t xml:space="preserve"> (ישעיהו כ״ד:ט״ז). Substantive content is otherwise identical to what the Rav conveyed.</w:t>
             </w:r>
           </w:p>
         </w:tc>
@@ -10415,402 +10831,6 @@
       <w:pPr>
         <w:spacing w:before="0" w:after="80"/>
       </w:pPr>
-    </w:p>
-    <w:p>
-      <w:pPr>
-        <w:spacing w:before="0" w:after="80" w:line="312" w:lineRule="auto"/>
-        <w:ind w:left="480" w:hanging="480"/>
-      </w:pPr>
-      <w:r>
-        <w:rPr>
-          <w:rFonts w:ascii="Georgia" w:hAnsi="Georgia" w:cs="SBL Hebrew" w:eastAsia="Georgia"/>
-          <w:b/>
-          <w:color w:val="B8860B"/>
-          <w:sz w:val="21"/>
-        </w:rPr>
-        <w:t xml:space="preserve">18. </w:t>
-      </w:r>
-      <w:r>
-        <w:rPr>
-          <w:rFonts w:ascii="Georgia" w:hAnsi="Georgia" w:cs="SBL Hebrew" w:eastAsia="Georgia"/>
-          <w:b w:val="0"/>
-          <w:i w:val="0"/>
-          <w:color w:val="1A1A1A"/>
-          <w:sz w:val="21"/>
-        </w:rPr>
-        <w:t>מ״ב — late-arrival priorities on Shabbos morning</w:t>
-      </w:r>
-      <w:r>
-        <w:rPr>
-          <w:rFonts w:ascii="Georgia" w:hAnsi="Georgia" w:cs="SBL Hebrew" w:eastAsia="Georgia"/>
-          <w:color w:val="1A1A1A"/>
-          <w:sz w:val="21"/>
-        </w:rPr>
-        <w:t xml:space="preserve"> — </w:t>
-      </w:r>
-      <w:r>
-        <w:rPr>
-          <w:rFonts w:ascii="Georgia" w:hAnsi="Georgia" w:cs="SBL Hebrew" w:eastAsia="Georgia"/>
-          <w:b w:val="0"/>
-          <w:i w:val="0"/>
-          <w:color w:val="1A1A1A"/>
-          <w:sz w:val="21"/>
-        </w:rPr>
-        <w:t xml:space="preserve">The </w:t>
-      </w:r>
-      <w:r>
-        <w:rPr>
-          <w:rFonts w:ascii="Georgia" w:hAnsi="Georgia" w:cs="SBL Hebrew" w:eastAsia="Georgia"/>
-          <w:b/>
-          <w:i w:val="0"/>
-          <w:color w:val="1A1A1A"/>
-          <w:sz w:val="21"/>
-        </w:rPr>
-        <w:t>מִשְׁנָה בְּרוּרָה</w:t>
-      </w:r>
-      <w:r>
-        <w:rPr>
-          <w:rFonts w:ascii="Georgia" w:hAnsi="Georgia" w:cs="SBL Hebrew" w:eastAsia="Georgia"/>
-          <w:b w:val="0"/>
-          <w:i w:val="0"/>
-          <w:color w:val="1A1A1A"/>
-          <w:sz w:val="21"/>
-        </w:rPr>
-        <w:t xml:space="preserve"> gives an explicit hierarchy for one who arrives late to Shabbos morning davening and needs to catch up: (1) </w:t>
-      </w:r>
-      <w:r>
-        <w:rPr>
-          <w:rFonts w:ascii="SBL Hebrew" w:hAnsi="SBL Hebrew" w:cs="SBL Hebrew" w:eastAsia="SBL Hebrew"/>
-          <w:b w:val="0"/>
-          <w:i w:val="0"/>
-          <w:color w:val="1A1A1A"/>
-          <w:sz w:val="21"/>
-        </w:rPr>
-        <w:t>בָּרוּךְ שֶׁאָמַר</w:t>
-      </w:r>
-      <w:r>
-        <w:rPr>
-          <w:rFonts w:ascii="Georgia" w:hAnsi="Georgia" w:cs="SBL Hebrew" w:eastAsia="Georgia"/>
-          <w:b w:val="0"/>
-          <w:i w:val="0"/>
-          <w:color w:val="1A1A1A"/>
-          <w:sz w:val="21"/>
-        </w:rPr>
-        <w:t xml:space="preserve"> — the opening ברכה of פסוקי דזמרה; (2) </w:t>
-      </w:r>
-      <w:r>
-        <w:rPr>
-          <w:rFonts w:ascii="SBL Hebrew" w:hAnsi="SBL Hebrew" w:cs="SBL Hebrew" w:eastAsia="SBL Hebrew"/>
-          <w:b w:val="0"/>
-          <w:i w:val="0"/>
-          <w:color w:val="1A1A1A"/>
-          <w:sz w:val="21"/>
-        </w:rPr>
-        <w:t>אַשְׁרֵי</w:t>
-      </w:r>
-      <w:r>
-        <w:rPr>
-          <w:rFonts w:ascii="Georgia" w:hAnsi="Georgia" w:cs="SBL Hebrew" w:eastAsia="Georgia"/>
-          <w:b w:val="0"/>
-          <w:i w:val="0"/>
-          <w:color w:val="1A1A1A"/>
-          <w:sz w:val="21"/>
-        </w:rPr>
-        <w:t xml:space="preserve"> (תהילים קמ״ה) — the halachically central פרק of the section; (3) </w:t>
-      </w:r>
-      <w:r>
-        <w:rPr>
-          <w:rFonts w:ascii="SBL Hebrew" w:hAnsi="SBL Hebrew" w:cs="SBL Hebrew" w:eastAsia="SBL Hebrew"/>
-          <w:b w:val="0"/>
-          <w:i w:val="0"/>
-          <w:color w:val="1A1A1A"/>
-          <w:sz w:val="21"/>
-        </w:rPr>
-        <w:t>יִשְׁתַּבַּח</w:t>
-      </w:r>
-      <w:r>
-        <w:rPr>
-          <w:rFonts w:ascii="Georgia" w:hAnsi="Georgia" w:cs="SBL Hebrew" w:eastAsia="Georgia"/>
-          <w:b w:val="0"/>
-          <w:i w:val="0"/>
-          <w:color w:val="1A1A1A"/>
-          <w:sz w:val="21"/>
-        </w:rPr>
-        <w:t xml:space="preserve"> — the closing ברכה; (4) </w:t>
-      </w:r>
-      <w:r>
-        <w:rPr>
-          <w:rFonts w:ascii="SBL Hebrew" w:hAnsi="SBL Hebrew" w:cs="SBL Hebrew" w:eastAsia="SBL Hebrew"/>
-          <w:b w:val="0"/>
-          <w:i w:val="0"/>
-          <w:color w:val="1A1A1A"/>
-          <w:sz w:val="21"/>
-        </w:rPr>
-        <w:t>נִשְׁמַת כָּל חַי</w:t>
-      </w:r>
-      <w:r>
-        <w:rPr>
-          <w:rFonts w:ascii="Georgia" w:hAnsi="Georgia" w:cs="SBL Hebrew" w:eastAsia="Georgia"/>
-          <w:b w:val="0"/>
-          <w:i w:val="0"/>
-          <w:color w:val="1A1A1A"/>
-          <w:sz w:val="21"/>
-        </w:rPr>
-        <w:t xml:space="preserve"> — the Shabbos-specific centerpiece of the extended שירה. The משנה ברורה is explicit that the extra קפּיטלַך added on Shabbos are </w:t>
-      </w:r>
-      <w:r>
-        <w:rPr>
-          <w:rFonts w:ascii="Georgia" w:hAnsi="Georgia" w:cs="SBL Hebrew" w:eastAsia="Georgia"/>
-          <w:b w:val="0"/>
-          <w:i/>
-          <w:color w:val="1A1A1A"/>
-          <w:sz w:val="21"/>
-        </w:rPr>
-        <w:t>not</w:t>
-      </w:r>
-      <w:r>
-        <w:rPr>
-          <w:rFonts w:ascii="Georgia" w:hAnsi="Georgia" w:cs="SBL Hebrew" w:eastAsia="Georgia"/>
-          <w:b w:val="0"/>
-          <w:i w:val="0"/>
-          <w:color w:val="1A1A1A"/>
-          <w:sz w:val="21"/>
-        </w:rPr>
-        <w:t xml:space="preserve"> </w:t>
-      </w:r>
-      <w:r>
-        <w:rPr>
-          <w:rFonts w:ascii="SBL Hebrew" w:hAnsi="SBL Hebrew" w:cs="SBL Hebrew" w:eastAsia="SBL Hebrew"/>
-          <w:b w:val="0"/>
-          <w:i w:val="0"/>
-          <w:color w:val="1A1A1A"/>
-          <w:sz w:val="21"/>
-        </w:rPr>
-        <w:t>מעכב</w:t>
-      </w:r>
-      <w:r>
-        <w:rPr>
-          <w:rFonts w:ascii="Georgia" w:hAnsi="Georgia" w:cs="SBL Hebrew" w:eastAsia="Georgia"/>
-          <w:b w:val="0"/>
-          <w:i w:val="0"/>
-          <w:color w:val="1A1A1A"/>
-          <w:sz w:val="21"/>
-        </w:rPr>
-        <w:t xml:space="preserve"> — they may be omitted if time is tight and made up later if desired. But נִשְׁמַת is not to be missed. It is the central Shabbos-specific piece of the entire שירה of the morning.</w:t>
-      </w:r>
-    </w:p>
-    <w:p>
-      <w:pPr>
-        <w:spacing w:before="0" w:after="80" w:line="312" w:lineRule="auto"/>
-        <w:ind w:left="480" w:hanging="480"/>
-      </w:pPr>
-      <w:r>
-        <w:rPr>
-          <w:rFonts w:ascii="Georgia" w:hAnsi="Georgia" w:cs="SBL Hebrew" w:eastAsia="Georgia"/>
-          <w:b/>
-          <w:color w:val="B8860B"/>
-          <w:sz w:val="21"/>
-        </w:rPr>
-        <w:t xml:space="preserve">19. </w:t>
-      </w:r>
-      <w:r>
-        <w:rPr>
-          <w:rFonts w:ascii="Georgia" w:hAnsi="Georgia" w:cs="SBL Hebrew" w:eastAsia="Georgia"/>
-          <w:b w:val="0"/>
-          <w:i w:val="0"/>
-          <w:color w:val="1A1A1A"/>
-          <w:sz w:val="21"/>
-        </w:rPr>
-        <w:t>זוהר הקדוש (via תוספות סנהדרין ל״ז) — the seventh wing</w:t>
-      </w:r>
-      <w:r>
-        <w:rPr>
-          <w:rFonts w:ascii="Georgia" w:hAnsi="Georgia" w:cs="SBL Hebrew" w:eastAsia="Georgia"/>
-          <w:color w:val="1A1A1A"/>
-          <w:sz w:val="21"/>
-        </w:rPr>
-        <w:t xml:space="preserve"> — </w:t>
-      </w:r>
-      <w:r>
-        <w:rPr>
-          <w:rFonts w:ascii="Georgia" w:hAnsi="Georgia" w:cs="SBL Hebrew" w:eastAsia="Georgia"/>
-          <w:b/>
-          <w:i w:val="0"/>
-          <w:color w:val="1A1A1A"/>
-          <w:sz w:val="21"/>
-        </w:rPr>
-        <w:t>תוספות במסכת סנהדרין דף ל״ז</w:t>
-      </w:r>
-      <w:r>
-        <w:rPr>
-          <w:rFonts w:ascii="Georgia" w:hAnsi="Georgia" w:cs="SBL Hebrew" w:eastAsia="Georgia"/>
-          <w:b w:val="0"/>
-          <w:i w:val="0"/>
-          <w:color w:val="1A1A1A"/>
-          <w:sz w:val="21"/>
-        </w:rPr>
-        <w:t xml:space="preserve"> brings a זוהר / midrashic tradition on the wings of the </w:t>
-      </w:r>
-      <w:r>
-        <w:rPr>
-          <w:rFonts w:ascii="SBL Hebrew" w:hAnsi="SBL Hebrew" w:cs="SBL Hebrew" w:eastAsia="SBL Hebrew"/>
-          <w:b w:val="0"/>
-          <w:i w:val="0"/>
-          <w:color w:val="1A1A1A"/>
-          <w:sz w:val="21"/>
-        </w:rPr>
-        <w:t>שרפים</w:t>
-      </w:r>
-      <w:r>
-        <w:rPr>
-          <w:rFonts w:ascii="Georgia" w:hAnsi="Georgia" w:cs="SBL Hebrew" w:eastAsia="Georgia"/>
-          <w:b w:val="0"/>
-          <w:i w:val="0"/>
-          <w:color w:val="1A1A1A"/>
-          <w:sz w:val="21"/>
-        </w:rPr>
-        <w:t xml:space="preserve">. The pasuk in </w:t>
-      </w:r>
-      <w:r>
-        <w:rPr>
-          <w:rFonts w:ascii="Georgia" w:hAnsi="Georgia" w:cs="SBL Hebrew" w:eastAsia="Georgia"/>
-          <w:b/>
-          <w:i w:val="0"/>
-          <w:color w:val="1A1A1A"/>
-          <w:sz w:val="21"/>
-        </w:rPr>
-        <w:t>ישעיהו ו׳:ב</w:t>
-      </w:r>
-      <w:r>
-        <w:rPr>
-          <w:rFonts w:ascii="Georgia" w:hAnsi="Georgia" w:cs="SBL Hebrew" w:eastAsia="Georgia"/>
-          <w:b w:val="0"/>
-          <w:i w:val="0"/>
-          <w:color w:val="1A1A1A"/>
-          <w:sz w:val="21"/>
-        </w:rPr>
-        <w:t xml:space="preserve"> describes: </w:t>
-      </w:r>
-      <w:r>
-        <w:rPr>
-          <w:rFonts w:ascii="SBL Hebrew" w:hAnsi="SBL Hebrew" w:cs="SBL Hebrew" w:eastAsia="SBL Hebrew"/>
-          <w:b w:val="0"/>
-          <w:i w:val="0"/>
-          <w:color w:val="1A1A1A"/>
-          <w:sz w:val="21"/>
-        </w:rPr>
-        <w:t>"שֵׁשׁ כְּנָפַיִם שֵׁשׁ כְּנָפַיִם לְאֶחָד"</w:t>
-      </w:r>
-      <w:r>
-        <w:rPr>
-          <w:rFonts w:ascii="Georgia" w:hAnsi="Georgia" w:cs="SBL Hebrew" w:eastAsia="Georgia"/>
-          <w:b w:val="0"/>
-          <w:i w:val="0"/>
-          <w:color w:val="1A1A1A"/>
-          <w:sz w:val="21"/>
-        </w:rPr>
-        <w:t xml:space="preserve"> — six wings per שרף. Each wing corresponds to one day of the week and is the vehicle for that day's </w:t>
-      </w:r>
-      <w:r>
-        <w:rPr>
-          <w:rFonts w:ascii="SBL Hebrew" w:hAnsi="SBL Hebrew" w:cs="SBL Hebrew" w:eastAsia="SBL Hebrew"/>
-          <w:b w:val="0"/>
-          <w:i w:val="0"/>
-          <w:color w:val="1A1A1A"/>
-          <w:sz w:val="21"/>
-        </w:rPr>
-        <w:t>שירה</w:t>
-      </w:r>
-      <w:r>
-        <w:rPr>
-          <w:rFonts w:ascii="Georgia" w:hAnsi="Georgia" w:cs="SBL Hebrew" w:eastAsia="Georgia"/>
-          <w:b w:val="0"/>
-          <w:i w:val="0"/>
-          <w:color w:val="1A1A1A"/>
-          <w:sz w:val="21"/>
-        </w:rPr>
-        <w:t xml:space="preserve">. Sunday one wing, Monday another, through the six weekdays. On Shabbos, the מלאכים have </w:t>
-      </w:r>
-      <w:r>
-        <w:rPr>
-          <w:rFonts w:ascii="Georgia" w:hAnsi="Georgia" w:cs="SBL Hebrew" w:eastAsia="Georgia"/>
-          <w:b w:val="0"/>
-          <w:i/>
-          <w:color w:val="1A1A1A"/>
-          <w:sz w:val="21"/>
-        </w:rPr>
-        <w:t>no wing left</w:t>
-      </w:r>
-      <w:r>
-        <w:rPr>
-          <w:rFonts w:ascii="Georgia" w:hAnsi="Georgia" w:cs="SBL Hebrew" w:eastAsia="Georgia"/>
-          <w:b w:val="0"/>
-          <w:i w:val="0"/>
-          <w:color w:val="1A1A1A"/>
-          <w:sz w:val="21"/>
-        </w:rPr>
-        <w:t xml:space="preserve"> — they have "used up" all six. They ask הקב״ה: </w:t>
-      </w:r>
-      <w:r>
-        <w:rPr>
-          <w:rFonts w:ascii="Georgia" w:hAnsi="Georgia" w:cs="SBL Hebrew" w:eastAsia="Georgia"/>
-          <w:b w:val="0"/>
-          <w:i/>
-          <w:color w:val="1A1A1A"/>
-          <w:sz w:val="21"/>
-        </w:rPr>
-        <w:t>who will sing today?</w:t>
-      </w:r>
-      <w:r>
-        <w:rPr>
-          <w:rFonts w:ascii="Georgia" w:hAnsi="Georgia" w:cs="SBL Hebrew" w:eastAsia="Georgia"/>
-          <w:b w:val="0"/>
-          <w:i w:val="0"/>
-          <w:color w:val="1A1A1A"/>
-          <w:sz w:val="21"/>
-        </w:rPr>
-        <w:t xml:space="preserve"> The answer: </w:t>
-      </w:r>
-      <w:r>
-        <w:rPr>
-          <w:rFonts w:ascii="SBL Hebrew" w:hAnsi="SBL Hebrew" w:cs="SBL Hebrew" w:eastAsia="SBL Hebrew"/>
-          <w:b w:val="0"/>
-          <w:i w:val="0"/>
-          <w:color w:val="1A1A1A"/>
-          <w:sz w:val="21"/>
-        </w:rPr>
-        <w:t>כנסת ישראל</w:t>
-      </w:r>
-      <w:r>
-        <w:rPr>
-          <w:rFonts w:ascii="Georgia" w:hAnsi="Georgia" w:cs="SBL Hebrew" w:eastAsia="Georgia"/>
-          <w:b w:val="0"/>
-          <w:i w:val="0"/>
-          <w:color w:val="1A1A1A"/>
-          <w:sz w:val="21"/>
-        </w:rPr>
-        <w:t xml:space="preserve"> — Klal Yisrael is the seventh wing. Shabbos is </w:t>
-      </w:r>
-      <w:r>
-        <w:rPr>
-          <w:rFonts w:ascii="SBL Hebrew" w:hAnsi="SBL Hebrew" w:cs="SBL Hebrew" w:eastAsia="SBL Hebrew"/>
-          <w:b w:val="0"/>
-          <w:i w:val="0"/>
-          <w:color w:val="1A1A1A"/>
-          <w:sz w:val="21"/>
-        </w:rPr>
-        <w:t>"אוֹת הִיא בֵּינִי וּבֵין בְּנֵי יִשְׂרָאֵל"</w:t>
-      </w:r>
-      <w:r>
-        <w:rPr>
-          <w:rFonts w:ascii="Georgia" w:hAnsi="Georgia" w:cs="SBL Hebrew" w:eastAsia="Georgia"/>
-          <w:b w:val="0"/>
-          <w:i w:val="0"/>
-          <w:color w:val="1A1A1A"/>
-          <w:sz w:val="21"/>
-        </w:rPr>
-        <w:t xml:space="preserve"> — הקב״ה prefers the שירה of His children on this day over the שירה of the מלאכים. The added Shabbos-morning מזמורים are, structurally, the שירה of the מלאכים now sung by Klal Yisrael.</w:t>
-      </w:r>
     </w:p>
     <w:p>
       <w:pPr>

</xml_diff>